<commit_message>
Initial commit: YOLO MD931 code
</commit_message>
<xml_diff>
--- a/MDYOLO_RSL_letter.docx
+++ b/MDYOLO_RSL_letter.docx
@@ -29,7 +29,7 @@
           <w:i w:val="0"/>
           <w:sz w:val="22"/>
         </w:rPr>
-        <w:t>Qinmin Wang¹, Hongyuan Wang¹, Peipei Li¹, and Zongzhong Wang²,*</w:t>
+        <w:t>Qinmin Wang¹, Zhenzhen Hu², Hongyuan Wang¹, and Yuming Sun¹,*</w:t>
       </w:r>
     </w:p>
     <w:p>
@@ -59,7 +59,7 @@
           <w:i w:val="0"/>
           <w:sz w:val="22"/>
         </w:rPr>
-        <w:t>² School of Electromechanical Engineering, Guangdong University of Technology, Guangzhou, China</w:t>
+        <w:t>² Chengdu University of Information Technology, Chengdu, China</w:t>
       </w:r>
     </w:p>
     <w:p>
@@ -74,7 +74,31 @@
           <w:i/>
           <w:sz w:val="22"/>
         </w:rPr>
-        <w:t>Corresponding author. Email: wangzz@gdut.edu.cn; ORCID: [to be supplied]</w:t>
+        <w:t>Corresponding author. Email: sunyuming@gdust.edu.cn</w:t>
+      </w:r>
+    </w:p>
+    <w:p>
+      <w:pPr>
+        <w:spacing w:after="40" w:line="240" w:lineRule="auto"/>
+        <w:jc w:val="center"/>
+      </w:pPr>
+      <w:r>
+        <w:rPr>
+          <w:rFonts w:ascii="Times New Roman" w:hAnsi="Times New Roman" w:eastAsia="Times New Roman"/>
+          <w:b w:val="0"/>
+          <w:i/>
+          <w:sz w:val="22"/>
+        </w:rPr>
+        <w:t>ORCID iDs:</w:t>
+      </w:r>
+      <w:r>
+        <w:rPr>
+          <w:rFonts w:ascii="Times New Roman" w:hAnsi="Times New Roman" w:eastAsia="Times New Roman"/>
+          <w:b w:val="0"/>
+          <w:i w:val="0"/>
+          <w:sz w:val="22"/>
+        </w:rPr>
+        <w:t xml:space="preserve"> Qinmin Wang, 0009-0006-0447-0482; Zhenzhen Hu, 0000-0003-2455-0691; Hongyuan Wang, 0000-0007-4278-771X; Yuming Sun, 0009-0003-7222-2390.</w:t>
       </w:r>
     </w:p>
     <w:p>
@@ -98,7 +122,25 @@
           <w:i w:val="0"/>
           <w:sz w:val="22"/>
         </w:rPr>
-        <w:t xml:space="preserve"> We present an end-to-end empirical reproducibility audit of MD-YOLO, a multi-scale adaptive, dual-attention enhanced YOLOv11 variant for UAV small-object detection. Previous assessment of this codebase relied purely on static source-code inspection; in this work, we convert the official VisDrone2019-DET split (6,471 training / 548 validation images, 7,019 total, 381,963 boxes) and run the complete detection pipeline on this real aerial corpus. Real-data execution uncovered four runtime defects missed by static review, including a critical double-stride decoding bug that silently yielded mAP = 0. After bug fixes, the pipeline runs end-to-end with converged training loss. Nevertheless, under a reduced training recipe (250 training images, 320 px input resolution, 40 epochs, CPU-only hardware), the model achieves per-class AP@0.50 = 0.0000. Diagnostic decomposition demonstrates that the proposed remedies (TaskAlignedAssigner + VariFocal Loss + WIoU) resolve localization deficiency (mean best-IoU increases from 0.24 to 0.40), while classification performance remains degraded, which originates from a limited data-compute regime rather than software bugs. Further zero-shot cross-domain evaluation on the UAVDT-M dataset reveals severe domain degradation, with mean best-IoU dropping from 0.40 to 0.17. We honestly report these negative experimental observations and clearly separate three non-overlapping categories of failure, to support reproducible UAV object-detection research.</w:t>
+        <w:t xml:space="preserve"> We present an end-to-end empirical reproducibility audit of MD-YOLO, a multi-scale adaptive, dual-attention enhanced YOLOv11 variant for UAV small-object detection. Previous assessment of this codebase relied purely on static source-code inspection; in this work, we convert the official VisDrone2019-DET split (6,471 training / 548 validation images, 7,019 total, 381,963 boxes) and run the complete detection pipeline on this real aerial corpus. Real-data execution uncovered four runtime defects missed by static review, including a critical double-stride decoding bug that silently yielded </w:t>
+      </w:r>
+      <w:r>
+        <w:rPr>
+          <w:rFonts w:ascii="Times New Roman" w:hAnsi="Times New Roman" w:eastAsia="Times New Roman"/>
+          <w:b w:val="0"/>
+          <w:i w:val="0"/>
+          <w:sz w:val="22"/>
+        </w:rPr>
+        <w:t>mAP=0</w:t>
+      </w:r>
+      <w:r>
+        <w:rPr>
+          <w:rFonts w:ascii="Times New Roman" w:hAnsi="Times New Roman" w:eastAsia="Times New Roman"/>
+          <w:b w:val="0"/>
+          <w:i w:val="0"/>
+          <w:sz w:val="22"/>
+        </w:rPr>
+        <w:t>. After bug fixes, the pipeline runs end-to-end with converged training loss. Nevertheless, under a reduced training recipe (250 training images, 320 px input resolution, 40 epochs, CPU-only hardware), the model achieves per-class AP@0.50 = 0.0000. Diagnostic decomposition demonstrates that the proposed remedies (TaskAlignedAssigner + VariFocal Loss + WIoU) resolve localization deficiency (mean best-IoU increases from 0.24 to 0.40). Nevertheless, classification performance remains poor, stemming from a constrained data-compute regime rather than software defects. Further zero-shot cross-domain evaluation on the UAVDT-M dataset reveals severe domain degradation, with mean best-IoU dropping from 0.40 to 0.27. We honestly report these negative experimental observations and clearly separate three non-overlapping categories of failure, to support reproducible UAV object-detection research.</w:t>
       </w:r>
     </w:p>
     <w:p>
@@ -151,7 +193,7 @@
           <w:i w:val="0"/>
           <w:sz w:val="22"/>
         </w:rPr>
-        <w:t>Unmanned aerial vehicle (UAV) remote sensing has become a cornerstone of modern earth observation, supporting traffic monitoring, disaster response, and precision agriculture (Xia et al. 2018; Cheng et al. 2023). Yet the small ground-sample distance and arbitrary viewing geometry of aerial platforms make object detection a canonical small-object problem: targets are tiny, densely packed, captured from varying altitudes, and frequently occluded (Cheng et al. 2023). Building on the YOLO family of detectors (Redmon et al. 2016; Jocher et al. 2023; Khanam et al. 2024), the MD-YOLO architecture (Multi-scale Adaptive &amp; Dual-Attention Enhanced YOLOv11; MD-YOLO, n.d.) targets this setting with a multi-scale adaptive convolution (MAC) backbone, a dual-attention feature aggregation (DAFA) neck, and four anchor-free detection heads (P2–P5), and—per its design specification—a training regimen layering masked autoencoder (MAE) pretraining (He et al. 2022) and SoftTeacher-style semi-supervised learning (Xu et al. 2021).</w:t>
+        <w:t>Unmanned aerial vehicle (UAV) remote sensing has become a cornerstone of modern earth observation, supporting traffic monitoring, disaster response, and precision agriculture (Xia et al. 2018; Cheng et al. 2023). Yet the small ground-sample distance and arbitrary viewing geometry of aerial platforms make object detection a canonical small-object problem: targets are tiny, densely packed, captured from varying altitudes, and frequently occluded (Cheng et al. 2023). Building on the YOLO family of detectors (Redmon et al. 2016; Jocher et al. 2023; Khanam et al. 2024), the MD-YOLO architecture (Multi-scale Adaptive &amp; Dual-Attention Enhanced YOLOv11; Zhou and Gong 2026) targets this setting with a multi-scale adaptive convolution (MAC) backbone, a dual-attention feature aggregation (DAFA) neck, and four anchor-free detection heads (P2–P5), and—per its design specification—a training regimen layering masked autoencoder (MAE) pretraining (He et al. 2022) and SoftTeacher-style semi-supervised learning (Xu et al. 2021).</w:t>
       </w:r>
     </w:p>
     <w:p>
@@ -166,7 +208,7 @@
           <w:i w:val="0"/>
           <w:sz w:val="22"/>
         </w:rPr>
-        <w:t>A design document is a specification, not a guarantee. Before any accuracy claim can be trusted, the implementation must be shown to (i) execute on real data, (ii) decode and train correctly, and (iii) produce detections whose localization and classification are internally consistent. Previous assessment of this codebase—including a prior static assessment—relied purely on source-code inspection. This paper fills this gap by carrying out empirical validation on real-world aerial data. Our contributions are: (1) we convert and verify the real VisDrone2019-DET dataset and execute the full pipeline on CPU-only hardware; (2) we surface and fix four runtime defects, the most severe of which silently zeroed all detection performance; and (3) we report an honest, negative-leaning result—the pipeline is now correct and localization is resolved, but the method's claimed accuracy is not reproduced under the reduced recipe, and we isolate the root cause as a classification data-regime limitation. We further conduct a real zero-shot cross-domain evaluation on UAVDT-M that quantifies a severe domain shift. We adopt the position that reporting a failed reproduction is itself a contribution to reproducibility, especially for methods whose headline numbers depend on training machinery that is described in the specification but not fully integrated or verified under the claimed full recipe (Pineau et al. 2020).</w:t>
+        <w:t>A design document is a specification, not a guarantee. Before any accuracy claim can be trusted, the implementation must be shown to (i) execute on real data, (ii) decode and train correctly, and (iii) produce detections whose localization and classification are internally consistent. Previous assessment of this codebase—including a prior static assessment—relied purely on source-code inspection. This paper fills this gap by carrying out empirical validation on real-world aerial data. Our contributions are: (1) we convert and verify the real VisDrone2019-DET dataset and execute the full pipeline on CPU-only hardware; (2) we surface and fix four runtime defects, the most severe of which silently zeroed all detection performance; and (3) we report an honest, negative-leaning result—the pipeline is now correct and localization is resolved, but the method's claimed accuracy is not reproduced under the reduced recipe, and we isolate the root cause as a classification data-regime limitation. We further conduct a real zero-shot cross-domain evaluation on UAVDT-M that quantifies a severe domain shift. We argue that reporting unsuccessful reproductions constitutes a valuable contribution to reproducible research. This is particularly relevant for methods whose headline performance relies on training components described in the technical specification yet not fully integrated or validated under the complete proposed training recipe (Pineau et al. 2020).</w:t>
       </w:r>
     </w:p>
     <w:p>
@@ -314,7 +356,7 @@
             <w:r>
               <w:drawing>
                 <wp:inline xmlns:a="http://schemas.openxmlformats.org/drawingml/2006/main" xmlns:pic="http://schemas.openxmlformats.org/drawingml/2006/picture">
-                  <wp:extent cx="4297680" cy="193900"/>
+                  <wp:extent cx="4297680" cy="187862"/>
                   <wp:docPr id="1" name="Picture 1"/>
                   <wp:cNvGraphicFramePr>
                     <a:graphicFrameLocks noChangeAspect="1"/>
@@ -335,7 +377,7 @@
                         <pic:spPr>
                           <a:xfrm>
                             <a:off x="0" y="0"/>
-                            <a:ext cx="4297680" cy="193900"/>
+                            <a:ext cx="4297680" cy="187862"/>
                           </a:xfrm>
                           <a:prstGeom prst="rect"/>
                         </pic:spPr>
@@ -558,7 +600,7 @@
           <w:i w:val="0"/>
           <w:sz w:val="22"/>
         </w:rPr>
-        <w:t>). We sample every 30 frames across all sequences, yielding 1,360 valid test images with 25,763 car ground-truth boxes, converted to YOLO format. All diagnostic subsets are deterministic: the in-domain diagnostic uses the first 120 validation images and the zero-shot diagnostic the first 300 of the frame-sampled UAVDT-M list (no random sampling is involved).</w:t>
+        <w:t>). We sample every 30 frames across all sequences, yielding 1,360 valid test images with 25,763 car ground-truth boxes, converted to YOLO format. All diagnostic subsets are deterministic: the in-domain diagnostic uses the first 120 validation images and the zero-shot diagnostic uses the first 300 entries from the frame-sampled UAVDT-M list (no random sampling is performed).</w:t>
       </w:r>
     </w:p>
     <w:p>
@@ -955,7 +997,7 @@
           <w:i w:val="0"/>
           <w:sz w:val="22"/>
         </w:rPr>
-        <w:t>We report COCO-style average precision (AP; averaged over classes, denoted mAP; Lin et al. 2014) at IoU 0.25, 0.50, and 0.50:0.95 (101-point interpolation) plus per-class AP@0.50. A low-confidence diagnostic probe (conf = 0.001, applied after class-aware NMS at IoU 0.7 with top-300 retention, i.e. at most 300 detections per image) retains essentially all detections to measure the best per-image IoU between any prediction and any ground-truth box.</w:t>
+        <w:t>We report COCO-style average precision (AP; averaged over classes, denoted mAP; Lin et al. 2014) at IoU = 0.25, 0.50, and 0.50:0.95 (101-point interpolation) plus per-class AP@0.50. A low-confidence diagnostic probe (conf = 0.001, applied after class-aware NMS at IoU 0.7 with top-300 retention, i.e. at most 300 detections per image) retains essentially all detections to measure the best per-image IoU between any prediction and any ground-truth box.</w:t>
       </w:r>
     </w:p>
     <w:p>
@@ -984,7 +1026,25 @@
           <w:i w:val="0"/>
           <w:sz w:val="22"/>
         </w:rPr>
-        <w:t>Real-data execution—not static inspection—revealed four defects, the most severe being a double-stride decode error: the erroneous form p_x^* = (g_x + offset)·s applies the stride twice—g_x is already a pixel coordinate, so only the offset should be scaled (p_x = g_x + offset·s)—projecting every predicted box out of image bounds and silently producing mAP = 0. The other three defects are a variable-length collate crash in the DataLoader, incorrect unpacking of the four-tuple returned by the letterbox resize, and an empty class-map filter that silently cleared all predictions; the complete defect list with symptoms and fixes is provided as Table S1 in the Supplementary Material. All defects were corrected identically across training, loss, and inference.</w:t>
+        <w:t xml:space="preserve">Real-data execution—not static inspection—revealed four defects, the most severe being a double-stride decode error: the erroneous form p_x^* = (g_x + offset)·s applies the stride twice—g_x is already a pixel coordinate, so only the offset should be scaled (p_x = g_x + offset·s)—projecting every predicted box out of image bounds and silently producing </w:t>
+      </w:r>
+      <w:r>
+        <w:rPr>
+          <w:rFonts w:ascii="Times New Roman" w:hAnsi="Times New Roman" w:eastAsia="Times New Roman"/>
+          <w:b w:val="0"/>
+          <w:i w:val="0"/>
+          <w:sz w:val="22"/>
+        </w:rPr>
+        <w:t>mAP=0</w:t>
+      </w:r>
+      <w:r>
+        <w:rPr>
+          <w:rFonts w:ascii="Times New Roman" w:hAnsi="Times New Roman" w:eastAsia="Times New Roman"/>
+          <w:b w:val="0"/>
+          <w:i w:val="0"/>
+          <w:sz w:val="22"/>
+        </w:rPr>
+        <w:t>. The other three defects are a variable-length collate crash in the DataLoader, incorrect unpacking of the four-tuple returned by the letterbox resize, and an empty class-map filter that silently cleared all predictions; the complete defect list with symptoms and fixes is provided as Table S1 in the Supplementary Material. All defects were corrected identically across training, loss, and inference.</w:t>
       </w:r>
     </w:p>
     <w:p>
@@ -1323,7 +1383,7 @@
           <w:i w:val="0"/>
           <w:sz w:val="22"/>
         </w:rPr>
-        <w:t>Implementing the prescribed remediation (TaskAlignedAssigner + VariFocal Loss + WIoU) lowered training loss from 29.30 to 5.89 and sharply improved localization while leaving classification unchanged (Table 3). The decomposition is the central finding: localization is resolved (mean best-IoU 0.24 → 0.40; 95/120 images with ≥0.25 overlap vs. 52/120) but classification remains open (per-class AP still 0.0000 even with every emitted detection retained at the diagnostic threshold, where the maximum predicted score is only 0.33). VariFocal Loss also removed pathological over-confidence (the maximum predicted score decreases from 0.95 to 0.33). We emphasize that the best per-image IoU diagnostic is class-agnostic—the maximum overlap between any predicted and any ground-truth box—so its improvement reflects localization only; because predicted classes remain wrong, per-class AP stays at 0.</w:t>
+        <w:t>Implementing the prescribed remediation (TaskAlignedAssigner + VariFocal Loss + WIoU) lowered training loss from 29.30 to 5.89 and sharply improved localization while leaving classification unchanged (Table 3). The decomposition is the central finding: localization is resolved (mean best-IoU 0.24 → 0.40; 95/120 images with ≥0.25 overlap vs. 52/120) but classification remains open (per-class AP still 0.0000 even with every emitted detection retained at the diagnostic threshold, where the maximum predicted score is only 0.33). VariFocal Loss also removed pathological over-confidence (the maximum predicted score decreased from 0.95 to 0.33). We emphasize that the best per-image IoU diagnostic is class-agnostic—the maximum overlap between any predicted and any ground-truth box—so its improvement reflects localization only; because predicted classes remain wrong, per-class AP stays at 0.</w:t>
       </w:r>
     </w:p>
     <w:tbl>
@@ -1416,7 +1476,7 @@
                 <w:i w:val="0"/>
                 <w:sz w:val="18"/>
               </w:rPr>
-              <w:t>Mean best per-image IoU vs. GT</w:t>
+              <w:t>Mean best per-image IoU vs. ground truth (GT)</w:t>
             </w:r>
           </w:p>
         </w:tc>
@@ -1834,7 +1894,7 @@
           <w:i w:val="0"/>
           <w:sz w:val="22"/>
         </w:rPr>
-        <w:t xml:space="preserve"> maps the 0-based VisDrone classes car (3) and van (4) onto the single UAVDT car class; the reported cross-domain metrics therefore refer to this merged vehicle class, not to a strict car-only evaluation, and predictions and ground truth are remapped consistently. The pipeline executes without runtime error (0/0 key mismatch for the model checkpoint), yet mAP@0.50 = 0.0000, consistent with the classification degradation observed above. Beyond classification, a severe localization degradation appears across the domain shift (Table 4, Figure 1): mean best-IoU drops from 0.40 to 0.17, and images with ≥0.25 / ≥0.50 overlap fall from 79% / 29% to 29% / 4.7%. This reflects an intrinsic domain gap between two UAV datasets—differences in flight altitude, scene type, camera parameters, and capture conditions (VisDrone versus UAVDT-M)—that the limited training budget cannot bridge.</w:t>
+        <w:t xml:space="preserve"> maps the 0-based VisDrone classes car (3) and van (4) onto the single UAVDT car class; the reported cross-domain metrics therefore refer to this merged vehicle class, not to a strict car-only evaluation, and predictions and ground truth are remapped consistently. The pipeline executes without runtime error (0/0 key mismatch for the model checkpoint), yet mAP@0.50 = 0.0000, consistent with the classification degradation observed above. Beyond classification, a severe localization degradation appears across the domain shift (Table 4, Figure 1): under the same class-agnostic protocol, mean best-IoU drops from 0.40 to 0.27, and images with ≥0.25 / ≥0.50 overlap fall from 79% / 29% to 49.7% / 15.0%. This reflects an intrinsic domain gap between two UAV datasets—differences in flight altitude, scene type, camera parameters, and capture conditions (VisDrone versus UAVDT-M)—that the limited training budget cannot bridge.</w:t>
       </w:r>
     </w:p>
     <w:tbl>
@@ -1986,7 +2046,7 @@
                 <w:i w:val="0"/>
                 <w:sz w:val="18"/>
               </w:rPr>
-              <w:t>Mean best-IoU (car)</w:t>
+              <w:t>Mean best-IoU (class-agnostic)</w:t>
             </w:r>
           </w:p>
         </w:tc>
@@ -2024,7 +2084,7 @@
                 <w:i w:val="0"/>
                 <w:sz w:val="18"/>
               </w:rPr>
-              <w:t>0.17</w:t>
+              <w:t>0.27</w:t>
             </w:r>
           </w:p>
         </w:tc>
@@ -2083,7 +2143,7 @@
                 <w:i w:val="0"/>
                 <w:sz w:val="18"/>
               </w:rPr>
-              <w:t>87/300 (29%)</w:t>
+              <w:t>149/300 (49.7%)</w:t>
             </w:r>
           </w:p>
         </w:tc>
@@ -2142,7 +2202,7 @@
                 <w:i w:val="0"/>
                 <w:sz w:val="18"/>
               </w:rPr>
-              <w:t>14/300 (4.7%)</w:t>
+              <w:t>45/300 (15.0%)</w:t>
             </w:r>
           </w:p>
         </w:tc>
@@ -2165,7 +2225,7 @@
           <w:i/>
           <w:sz w:val="18"/>
         </w:rPr>
-        <w:t>Table 4. In-domain vs. cross-domain localization diagnostic (conf = 0.001). In-domain figures use the same n = 120 VisDrone diagnostic subset; zero-shot figures use the first 300 images of the frame-sampled UAVDT-M list.</w:t>
+        <w:t>Table 4. In-domain vs. cross-domain localization diagnostic (conf = 0.001), under a single class-agnostic protocol: the best per-image IoU is the maximum overlap between any predicted box and any ground-truth box, evaluated with the same remediated (v2) checkpoint on both datasets. In-domain figures use the n = 120 VisDrone diagnostic subset; zero-shot figures use the first 300 images of the frame-sampled UAVDT-M list.</w:t>
       </w:r>
     </w:p>
     <w:p>
@@ -2219,7 +2279,7 @@
           <w:i/>
           <w:sz w:val="18"/>
         </w:rPr>
-        <w:t>Figure 1. Cross-domain localization degradation from VisDrone (in-domain) to UAVDT-M (zero-shot). (a) Mean best per-image IoU drops from 0.40 to 0.17. (b) Image-level overlap rates at IoU ≥ 0.25 and IoU ≥ 0.50 collapse across the domain shift.</w:t>
+        <w:t>Figure 1. Cross-domain localization degradation from VisDrone (in-domain) to UAVDT-M (zero-shot). (a) Mean best per-image IoU drops from 0.40 to 0.27. (b) Fraction of test images achieving at least 0.25 and 0.50 IoU overlap, showing performance degradation under domain shift.</w:t>
       </w:r>
     </w:p>
     <w:p>
@@ -2263,25 +2323,7 @@
           <w:i w:val="0"/>
           <w:sz w:val="22"/>
         </w:rPr>
-        <w:t xml:space="preserve">For reproducible research practice, we explicitly distinguish three mutually independent failure sources: (i) runtime and cross-mapping software bugs, which are fully resolved; (ii) zero-AP metrics under the small CPU training subset caused by limited data-compute budget—intra-domain localization capacity has already been restored, but classification remains open; (iii) a further localization drop under cross-domain evaluation (mean best-IoU from 0.40 to 0.17), which represents a genuine dataset domain gap and is distinct from failure (ii). All CPU-based reduced-regime results serve for code audit only and should </w:t>
-      </w:r>
-      <w:r>
-        <w:rPr>
-          <w:rFonts w:ascii="Times New Roman" w:hAnsi="Times New Roman" w:eastAsia="Times New Roman"/>
-          <w:b/>
-          <w:i w:val="0"/>
-          <w:sz w:val="22"/>
-        </w:rPr>
-        <w:t>not</w:t>
-      </w:r>
-      <w:r>
-        <w:rPr>
-          <w:rFonts w:ascii="Times New Roman" w:hAnsi="Times New Roman" w:eastAsia="Times New Roman"/>
-          <w:b w:val="0"/>
-          <w:i w:val="0"/>
-          <w:sz w:val="22"/>
-        </w:rPr>
-        <w:t xml:space="preserve"> be interpreted as the upper-bound performance of MD-YOLO. To achieve the performance claimed in the original design specification requires the full 6 471-image training set, a higher input resolution, longer training schedules, MAE backbone initialization, SoftTeacher semi-supervised learning, and GPU compute—the design specification prescribes these components without fixing a complete numerical recipe—and lies outside the scope of this audit. Exploratory future work includes a small-scale data/compute scaling study (e.g. 500–1 000 training images or higher input resolution) to verify the data-regime explanation, 3-class UAVDT evaluation (car/truck/bus), and few-shot fine-tuning on target-domain UAVDT annotations.</w:t>
+        <w:t>For reproducible research practice, we explicitly distinguish three mutually independent failure sources: (i) runtime and cross-mapping software defects, which are fully resolved; (ii) zero-AP metrics under the small CPU training subset caused by limited data-compute budget—intra-domain localization capacity has already been restored, but classification remains open; (iii) a further localization drop under cross-domain evaluation (mean best-IoU from 0.40 to 0.27), which represents a genuine dataset domain gap and is distinct from failure (ii). All results obtained under this CPU-only reduced training regime serve solely for code auditing and should not be interpreted as the upper-bound performance achievable for MD-YOLO. To achieve the performance claimed in the original design specification requires the full 6 471-image training set, a higher input resolution, longer training schedules, MAE backbone initialization, SoftTeacher semi-supervised learning, and GPU compute—the design specification prescribes these components without fixing a complete numerical recipe—and lies outside the scope of this audit. Exploratory future work includes a small-scale data/compute scaling study (e.g. 500–1 000 training images or higher input resolution) to verify the data-regime explanation, 3-class UAVDT evaluation (car/truck/bus), and few-shot fine-tuning on target-domain UAVDT annotations.</w:t>
       </w:r>
     </w:p>
     <w:p>
@@ -2310,7 +2352,7 @@
           <w:i w:val="0"/>
           <w:sz w:val="26"/>
         </w:rPr>
-        <w:t>Declaration of competing interest</w:t>
+        <w:t>Declaration of Competing Interests</w:t>
       </w:r>
     </w:p>
     <w:p>
@@ -2383,7 +2425,7 @@
           <w:i w:val="0"/>
           <w:sz w:val="22"/>
         </w:rPr>
-        <w:t>The audited MD-YOLO source code, the bug-fix patches, the dataset-conversion scripts, and the exact commands and configuration files for every experiment are provided in the Supplementary Material and will be deposited in a public repository upon acceptance ([repository URL, version/commit hash and access date to be supplied by the authors]). The converted VisDrone2019-DET YOLO-format annotations, the frame-sampled UAVDT-M list, and the deterministic diagnostic subsets (first 250 sorted training images for training; first 120 validation images and first 300 frame-sampled UAVDT-M images for diagnostics—no random sampling) are fully specified by the conversion scripts in the Supplementary Material. All experiments ran on CPU-only hardware; the full environment specification (OS, Python, PyTorch, CPU model, and dependency versions) is included in the Supplementary Material.</w:t>
+        <w:t>The MD-YOLO system under test is publicly available as source code at https://github.com/wqinmin975/yoloMD931 (commit: 451fe37055b2bdee8b5baf59f246f14856dc2524; accessed: 2026-10-10). The audit-specific artifacts of this work—bug-fix patches, dataset-conversion scripts, and exact experiment commands and configuration files—are included in the Supplementary Material and will be released in a public repository upon manuscript acceptance (repository URL, commit hash, and code-access date to be completed post-acceptance). The converted YOLO-format VisDrone2019-DET annotations, frame-sampled UAVDT-M image list, and deterministic diagnostic subsets (first 250 sorted training images for model training; first 120 validation images and first 300 frame-sampled UAVDT-M images for diagnostics; no random sampling is used) are fully reproducible via the conversion scripts provided in the Supplementary Material. All experiments were executed on CPU-only hardware; complete environment specifications including operating-system, Python, PyTorch version, CPU model, and full dependency list are documented within the Supplementary Material.</w:t>
       </w:r>
     </w:p>
     <w:p>
@@ -2541,7 +2583,7 @@
           <w:i w:val="0"/>
           <w:sz w:val="20"/>
         </w:rPr>
-        <w:t>MD-YOLO. n.d. Multi-Scale Adaptive &amp; Dual-Attention Enhanced YOLOv11 for UAV Small-Object Detection [Computer software and design document]. GitHub repository: [URL to be supplied]; version/commit: [to be supplied]; accessed [date to be supplied].</w:t>
+        <w:t>Zhou, W., and G. Gong. 2026. "MD-YOLO: A Multi-Scale Adaptive and Dual-Attention Enhanced YOLOv11 for Small Object Detection." Electronics 15 (10): 2099. https://doi.org/10.3390/electronics15102099. Source code of the implementation audited in this work: https://github.com/wqinmin975/yoloMD931 (commit: 451fe37055b2bdee8b5baf59f246f14856dc2524; accessed: 2026-10-10).</w:t>
       </w:r>
     </w:p>
     <w:p>

</xml_diff>